<commit_message>
Ch01 v3: delta table row, export README, verification log
Co-authored-by: GeneralKnowledge <GeneralKnowledge@users.noreply.github.com>
</commit_message>
<xml_diff>
--- a/export/review-slices/Good-Dog-Ch01-Trainer-Review-Slice-v3.docx
+++ b/export/review-slices/Good-Dog-Ch01-Trainer-Review-Slice-v3.docx
@@ -2641,6 +2641,72 @@
       </w:r>
       <w:r>
         <w:t xml:space="preserve">— sticky note, folded corner, app bookmark, photo of the page.</w:t>
+      </w:r>
+    </w:p>
+    <w:p>
+      <w:pPr>
+        <w:pStyle w:val="BodyText"/>
+      </w:pPr>
+      <w:r>
+        <w:rPr>
+          <w:bCs/>
+          <w:b/>
+        </w:rPr>
+        <w:t xml:space="preserve">What this chapter is not:</w:t>
+      </w:r>
+      <w:r>
+        <w:t xml:space="preserve"> </w:t>
+      </w:r>
+      <w:r>
+        <w:t xml:space="preserve">a glossary, a wall of trainer jargon, or a front-loaded syllabus. We do not list the teaching loop or five checks here on purpose — you get</w:t>
+      </w:r>
+      <w:r>
+        <w:t xml:space="preserve"> </w:t>
+      </w:r>
+      <w:r>
+        <w:rPr>
+          <w:bCs/>
+          <w:b/>
+        </w:rPr>
+        <w:t xml:space="preserve">attitude and navigation</w:t>
+      </w:r>
+      <w:r>
+        <w:t xml:space="preserve"> </w:t>
+      </w:r>
+      <w:r>
+        <w:t xml:space="preserve">first; step-by-step mechanics live in</w:t>
+      </w:r>
+      <w:r>
+        <w:t xml:space="preserve"> </w:t>
+      </w:r>
+      <w:r>
+        <w:rPr>
+          <w:bCs/>
+          <w:b/>
+        </w:rPr>
+        <w:t xml:space="preserve">Chapter 4</w:t>
+      </w:r>
+      <w:r>
+        <w:t xml:space="preserve"> </w:t>
+      </w:r>
+      <w:r>
+        <w:t xml:space="preserve">(loop) and</w:t>
+      </w:r>
+      <w:r>
+        <w:t xml:space="preserve"> </w:t>
+      </w:r>
+      <w:r>
+        <w:rPr>
+          <w:bCs/>
+          <w:b/>
+        </w:rPr>
+        <w:t xml:space="preserve">Chapter 14</w:t>
+      </w:r>
+      <w:r>
+        <w:t xml:space="preserve"> </w:t>
+      </w:r>
+      <w:r>
+        <w:t xml:space="preserve">(full check table) when you need them.</w:t>
       </w:r>
     </w:p>
     <w:tbl>

</xml_diff>